<commit_message>
add demo video and regle de gestion
</commit_message>
<xml_diff>
--- a/Rapport_SIR.docx
+++ b/Rapport_SIR.docx
@@ -1623,7 +1623,7 @@
           <wp:inline distT="0" distB="0" distL="0" distR="0">
             <wp:extent cx="5760720" cy="3057525"/>
             <wp:effectExtent l="0" t="0" r="0" b="0"/>
-            <wp:docPr id="2" name="Image 1"/>
+            <wp:docPr id="3" name="Image 1"/>
             <wp:cNvGraphicFramePr>
               <a:graphicFrameLocks xmlns:a="http://schemas.openxmlformats.org/drawingml/2006/main" noChangeAspect="1"/>
             </wp:cNvGraphicFramePr>
@@ -1631,11 +1631,11 @@
               <a:graphicData uri="http://schemas.openxmlformats.org/drawingml/2006/picture">
                 <pic:pic xmlns:pic="http://schemas.openxmlformats.org/drawingml/2006/picture">
                   <pic:nvPicPr>
-                    <pic:cNvPr id="1" name="Image 1"/>
+                    <pic:cNvPr id="2" name="Image 1"/>
                     <pic:cNvPicPr/>
                   </pic:nvPicPr>
                   <pic:blipFill>
-                    <a:blip r:embed="rId8"/>
+                    <a:blip r:embed="rId11"/>
                     <a:srcRect/>
                     <a:stretch>
                       <a:fillRect/>
@@ -1657,9 +1657,255 @@
         </w:drawing>
       </w:r>
     </w:p>
+    <w:p>
+      <w:pPr>
+        <w:pStyle w:val="ListParagraph"/>
+        <w:spacing w:before="100" w:after="100" w:line="240" w:lineRule="auto"/>
+        <w:ind w:left="720" w:right="0" w:firstLine="0"/>
+        <w:jc w:val="both"/>
+        <w:rPr>
+          <w:rFonts w:ascii="Times New Roman" w:cs="Times New Roman" w:eastAsia="Times New Roman" w:hAnsi="Times New Roman"/>
+          <w:b/>
+          <w:bCs/>
+          <w:sz w:val="28"/>
+          <w:szCs w:val="28"/>
+          <w:lang w:eastAsia="fr-FR"/>
+        </w:rPr>
+      </w:pPr>
+    </w:p>
+    <w:p>
+      <w:pPr>
+        <w:pStyle w:val="ListParagraph"/>
+        <w:spacing w:before="100" w:after="100" w:line="240" w:lineRule="auto"/>
+        <w:ind w:left="720" w:right="0" w:firstLine="0"/>
+        <w:jc w:val="both"/>
+        <w:rPr>
+          <w:rFonts w:ascii="Times New Roman" w:cs="Times New Roman" w:eastAsia="Times New Roman" w:hAnsi="Times New Roman"/>
+          <w:b/>
+          <w:bCs/>
+          <w:sz w:val="28"/>
+          <w:szCs w:val="28"/>
+          <w:lang w:eastAsia="fr-FR"/>
+        </w:rPr>
+      </w:pPr>
+      <w:r>
+        <w:rPr>
+          <w:rFonts w:ascii="Times New Roman" w:cs="Times New Roman" w:eastAsia="Times New Roman" w:hAnsi="Times New Roman"/>
+          <w:b/>
+          <w:bCs/>
+          <w:sz w:val="28"/>
+          <w:szCs w:val="28"/>
+          <w:lang w:eastAsia="fr-FR"/>
+        </w:rPr>
+        <w:t>6. Règle de gestion</w:t>
+      </w:r>
+    </w:p>
+    <w:p>
+      <w:pPr>
+        <w:pStyle w:val="ListParagraph"/>
+        <w:spacing w:before="100" w:after="100" w:line="240" w:lineRule="auto"/>
+        <w:ind w:left="720" w:right="0" w:firstLine="0"/>
+        <w:jc w:val="both"/>
+        <w:rPr>
+          <w:rFonts w:ascii="Times New Roman" w:cs="Times New Roman" w:eastAsia="Times New Roman" w:hAnsi="Times New Roman"/>
+          <w:b/>
+          <w:bCs/>
+          <w:sz w:val="28"/>
+          <w:szCs w:val="28"/>
+          <w:lang w:eastAsia="fr-FR"/>
+        </w:rPr>
+      </w:pPr>
+    </w:p>
+    <w:p>
+      <w:pPr>
+        <w:pStyle w:val="ListParagraph"/>
+        <w:numPr>
+          <w:ilvl w:val="0"/>
+          <w:numId w:val="9"/>
+        </w:numPr>
+        <w:spacing w:before="100" w:after="100" w:line="240" w:lineRule="auto"/>
+        <w:jc w:val="both"/>
+        <w:rPr>
+          <w:rFonts w:ascii="Times New Roman" w:cs="Times New Roman" w:eastAsia="Times New Roman" w:hAnsi="Times New Roman"/>
+          <w:b/>
+          <w:bCs/>
+          <w:sz w:val="28"/>
+          <w:szCs w:val="28"/>
+          <w:lang w:eastAsia="fr-FR"/>
+        </w:rPr>
+      </w:pPr>
+      <w:r>
+        <w:rPr>
+          <w:rFonts w:ascii="Times New Roman" w:cs="Times New Roman" w:eastAsia="Times New Roman" w:hAnsi="Times New Roman"/>
+          <w:b w:val="off"/>
+          <w:bCs w:val="off"/>
+          <w:sz w:val="28"/>
+          <w:szCs w:val="28"/>
+          <w:lang w:eastAsia="fr-FR"/>
+        </w:rPr>
+        <w:t>Un organisateur peut gérer plusieurs concert (CRUD) et un concert n’appartient qu’a un organisateur</w:t>
+      </w:r>
+    </w:p>
+    <w:p>
+      <w:pPr>
+        <w:pStyle w:val="ListParagraph"/>
+        <w:numPr>
+          <w:ilvl w:val="0"/>
+          <w:numId w:val="9"/>
+        </w:numPr>
+        <w:spacing w:before="100" w:after="100" w:line="240" w:lineRule="auto"/>
+        <w:jc w:val="both"/>
+        <w:rPr>
+          <w:rFonts w:ascii="Times New Roman" w:cs="Times New Roman" w:eastAsia="Times New Roman" w:hAnsi="Times New Roman"/>
+          <w:b/>
+          <w:bCs/>
+          <w:sz w:val="28"/>
+          <w:szCs w:val="28"/>
+          <w:lang w:eastAsia="fr-FR"/>
+        </w:rPr>
+      </w:pPr>
+      <w:r>
+        <w:rPr>
+          <w:rFonts w:ascii="Times New Roman" w:cs="Times New Roman" w:eastAsia="Times New Roman" w:hAnsi="Times New Roman"/>
+          <w:b w:val="off"/>
+          <w:bCs w:val="off"/>
+          <w:sz w:val="28"/>
+          <w:szCs w:val="28"/>
+          <w:lang w:eastAsia="fr-FR"/>
+        </w:rPr>
+        <w:t>Un concert dispose de plusieurs places</w:t>
+      </w:r>
+    </w:p>
+    <w:p>
+      <w:pPr>
+        <w:pStyle w:val="ListParagraph"/>
+        <w:numPr>
+          <w:ilvl w:val="0"/>
+          <w:numId w:val="9"/>
+        </w:numPr>
+        <w:spacing w:before="100" w:after="100" w:line="240" w:lineRule="auto"/>
+        <w:jc w:val="both"/>
+        <w:rPr>
+          <w:rFonts w:ascii="Times New Roman" w:cs="Times New Roman" w:eastAsia="Times New Roman" w:hAnsi="Times New Roman"/>
+          <w:b/>
+          <w:bCs/>
+          <w:sz w:val="28"/>
+          <w:szCs w:val="28"/>
+          <w:lang w:eastAsia="fr-FR"/>
+        </w:rPr>
+      </w:pPr>
+      <w:r>
+        <w:rPr>
+          <w:rFonts w:ascii="Times New Roman" w:cs="Times New Roman" w:eastAsia="Times New Roman" w:hAnsi="Times New Roman"/>
+          <w:b w:val="off"/>
+          <w:bCs w:val="off"/>
+          <w:sz w:val="28"/>
+          <w:szCs w:val="28"/>
+          <w:lang w:eastAsia="fr-FR"/>
+        </w:rPr>
+        <w:t>Un concert dispose de plusieurs passages d’artistes</w:t>
+      </w:r>
+    </w:p>
+    <w:p>
+      <w:pPr>
+        <w:pStyle w:val="ListParagraph"/>
+        <w:numPr>
+          <w:ilvl w:val="0"/>
+          <w:numId w:val="9"/>
+        </w:numPr>
+        <w:spacing w:before="100" w:after="100" w:line="240" w:lineRule="auto"/>
+        <w:jc w:val="both"/>
+        <w:rPr>
+          <w:rFonts w:ascii="Times New Roman" w:cs="Times New Roman" w:eastAsia="Times New Roman" w:hAnsi="Times New Roman"/>
+          <w:b/>
+          <w:bCs/>
+          <w:sz w:val="28"/>
+          <w:szCs w:val="28"/>
+          <w:lang w:eastAsia="fr-FR"/>
+        </w:rPr>
+      </w:pPr>
+      <w:r>
+        <w:rPr>
+          <w:rFonts w:ascii="Times New Roman" w:cs="Times New Roman" w:eastAsia="Times New Roman" w:hAnsi="Times New Roman"/>
+          <w:b/>
+          <w:bCs/>
+          <w:sz w:val="28"/>
+          <w:szCs w:val="28"/>
+          <w:lang w:eastAsia="fr-FR"/>
+        </w:rPr>
+        <w:t>U</w:t>
+      </w:r>
+      <w:r>
+        <w:rPr>
+          <w:rFonts w:ascii="Times New Roman" w:cs="Times New Roman" w:eastAsia="Times New Roman" w:hAnsi="Times New Roman"/>
+          <w:b w:val="off"/>
+          <w:bCs w:val="off"/>
+          <w:sz w:val="28"/>
+          <w:szCs w:val="28"/>
+          <w:lang w:eastAsia="fr-FR"/>
+        </w:rPr>
+        <w:t>n ticket concerne une place d’un concert</w:t>
+      </w:r>
+    </w:p>
+    <w:p>
+      <w:pPr>
+        <w:pStyle w:val="ListParagraph"/>
+        <w:numPr>
+          <w:ilvl w:val="0"/>
+          <w:numId w:val="9"/>
+        </w:numPr>
+        <w:spacing w:before="100" w:after="100" w:line="240" w:lineRule="auto"/>
+        <w:jc w:val="both"/>
+        <w:rPr>
+          <w:rFonts w:ascii="Times New Roman" w:cs="Times New Roman" w:eastAsia="Times New Roman" w:hAnsi="Times New Roman"/>
+          <w:b/>
+          <w:bCs/>
+          <w:sz w:val="28"/>
+          <w:szCs w:val="28"/>
+          <w:lang w:eastAsia="fr-FR"/>
+        </w:rPr>
+      </w:pPr>
+      <w:r>
+        <w:rPr>
+          <w:rFonts w:ascii="Times New Roman" w:cs="Times New Roman" w:eastAsia="Times New Roman" w:hAnsi="Times New Roman"/>
+          <w:b w:val="off"/>
+          <w:bCs w:val="off"/>
+          <w:sz w:val="28"/>
+          <w:szCs w:val="28"/>
+          <w:lang w:eastAsia="fr-FR"/>
+        </w:rPr>
+        <w:t>Un concert peut avoir plusieurs tarifs (Price)</w:t>
+      </w:r>
+    </w:p>
+    <w:p>
+      <w:pPr>
+        <w:pStyle w:val="ListParagraph"/>
+        <w:spacing w:before="100" w:after="100" w:line="240" w:lineRule="auto"/>
+        <w:ind w:right="0"/>
+        <w:jc w:val="both"/>
+        <w:rPr>
+          <w:rFonts w:ascii="Times New Roman" w:cs="Times New Roman" w:eastAsia="Times New Roman" w:hAnsi="Times New Roman"/>
+          <w:b/>
+          <w:bCs/>
+          <w:sz w:val="28"/>
+          <w:szCs w:val="28"/>
+          <w:lang w:eastAsia="fr-FR"/>
+        </w:rPr>
+      </w:pPr>
+    </w:p>
+    <w:p>
+      <w:pPr>
+        <w:jc w:val="both"/>
+        <w:rPr>
+          <w:rFonts w:ascii="Times New Roman" w:cs="Times New Roman" w:hAnsi="Times New Roman"/>
+          <w:sz w:val="28"/>
+          <w:szCs w:val="28"/>
+        </w:rPr>
+      </w:pPr>
+    </w:p>
     <w:sectPr>
-      <w:headerReference w:type="default" r:id="rId9"/>
-      <w:footerReference w:type="default" r:id="rId10"/>
+      <w:headerReference w:type="default" r:id="rId12"/>
+      <w:footerReference w:type="default" r:id="rId13"/>
       <w:pgSz w:w="11906" w:h="16838"/>
       <w:pgMar w:top="1417" w:right="1417" w:bottom="1417" w:left="1417" w:header="708" w:footer="708" w:gutter="0"/>
       <w:cols w:space="708"/>
@@ -2679,6 +2925,135 @@
       </w:pPr>
     </w:lvl>
   </w:abstractNum>
+  <w:abstractNum w:abstractNumId="8">
+    <w:multiLevelType w:val="hybridMultilevel"/>
+    <w:lvl w:ilvl="0" w:tentative="0">
+      <w:start w:val="1"/>
+      <w:numFmt w:val="bullet"/>
+      <w:isLgl w:val="off"/>
+      <w:suff w:val="tab"/>
+      <w:lvlText w:val="-"/>
+      <w:lvlJc w:val="left"/>
+      <w:pPr>
+        <w:ind w:left="1440" w:hanging="360"/>
+      </w:pPr>
+      <w:rPr>
+        <w:rFonts w:ascii="Calibri" w:hAnsi="Calibri"/>
+      </w:rPr>
+    </w:lvl>
+    <w:lvl w:ilvl="1" w:tentative="1">
+      <w:start w:val="1"/>
+      <w:numFmt w:val="bullet"/>
+      <w:isLgl w:val="off"/>
+      <w:suff w:val="tab"/>
+      <w:lvlText w:val="o"/>
+      <w:lvlJc w:val="left"/>
+      <w:pPr>
+        <w:ind w:left="2160" w:hanging="360"/>
+      </w:pPr>
+      <w:rPr>
+        <w:rFonts w:ascii="Courier New" w:hAnsi="Courier New"/>
+      </w:rPr>
+    </w:lvl>
+    <w:lvl w:ilvl="2" w:tentative="1">
+      <w:start w:val="1"/>
+      <w:numFmt w:val="bullet"/>
+      <w:isLgl w:val="off"/>
+      <w:suff w:val="tab"/>
+      <w:lvlText w:val=""/>
+      <w:lvlJc w:val="left"/>
+      <w:pPr>
+        <w:ind w:left="2880" w:hanging="360"/>
+      </w:pPr>
+      <w:rPr>
+        <w:rFonts w:ascii="Wingdings" w:hAnsi="Wingdings"/>
+      </w:rPr>
+    </w:lvl>
+    <w:lvl w:ilvl="3" w:tentative="1">
+      <w:start w:val="1"/>
+      <w:numFmt w:val="bullet"/>
+      <w:isLgl w:val="off"/>
+      <w:suff w:val="tab"/>
+      <w:lvlText w:val=""/>
+      <w:lvlJc w:val="left"/>
+      <w:pPr>
+        <w:ind w:left="3600" w:hanging="360"/>
+      </w:pPr>
+      <w:rPr>
+        <w:rFonts w:ascii="Symbol" w:hAnsi="Symbol"/>
+      </w:rPr>
+    </w:lvl>
+    <w:lvl w:ilvl="4" w:tentative="1">
+      <w:start w:val="1"/>
+      <w:numFmt w:val="bullet"/>
+      <w:isLgl w:val="off"/>
+      <w:suff w:val="tab"/>
+      <w:lvlText w:val="o"/>
+      <w:lvlJc w:val="left"/>
+      <w:pPr>
+        <w:ind w:left="4320" w:hanging="360"/>
+      </w:pPr>
+      <w:rPr>
+        <w:rFonts w:ascii="Courier New" w:hAnsi="Courier New"/>
+      </w:rPr>
+    </w:lvl>
+    <w:lvl w:ilvl="5" w:tentative="1">
+      <w:start w:val="1"/>
+      <w:numFmt w:val="bullet"/>
+      <w:isLgl w:val="off"/>
+      <w:suff w:val="tab"/>
+      <w:lvlText w:val=""/>
+      <w:lvlJc w:val="left"/>
+      <w:pPr>
+        <w:ind w:left="5040" w:hanging="360"/>
+      </w:pPr>
+      <w:rPr>
+        <w:rFonts w:ascii="Wingdings" w:hAnsi="Wingdings"/>
+      </w:rPr>
+    </w:lvl>
+    <w:lvl w:ilvl="6" w:tentative="1">
+      <w:start w:val="1"/>
+      <w:numFmt w:val="bullet"/>
+      <w:isLgl w:val="off"/>
+      <w:suff w:val="tab"/>
+      <w:lvlText w:val=""/>
+      <w:lvlJc w:val="left"/>
+      <w:pPr>
+        <w:ind w:left="5760" w:hanging="360"/>
+      </w:pPr>
+      <w:rPr>
+        <w:rFonts w:ascii="Symbol" w:hAnsi="Symbol"/>
+      </w:rPr>
+    </w:lvl>
+    <w:lvl w:ilvl="7" w:tentative="1">
+      <w:start w:val="1"/>
+      <w:numFmt w:val="bullet"/>
+      <w:isLgl w:val="off"/>
+      <w:suff w:val="tab"/>
+      <w:lvlText w:val="o"/>
+      <w:lvlJc w:val="left"/>
+      <w:pPr>
+        <w:ind w:left="6480" w:hanging="360"/>
+      </w:pPr>
+      <w:rPr>
+        <w:rFonts w:ascii="Courier New" w:hAnsi="Courier New"/>
+      </w:rPr>
+    </w:lvl>
+    <w:lvl w:ilvl="8" w:tentative="1">
+      <w:start w:val="1"/>
+      <w:numFmt w:val="bullet"/>
+      <w:isLgl w:val="off"/>
+      <w:suff w:val="tab"/>
+      <w:lvlText w:val=""/>
+      <w:lvlJc w:val="left"/>
+      <w:pPr>
+        <w:ind w:left="7200" w:hanging="360"/>
+      </w:pPr>
+      <w:rPr>
+        <w:rFonts w:ascii="Wingdings" w:hAnsi="Wingdings"/>
+      </w:rPr>
+    </w:lvl>
+  </w:abstractNum>
   <w:num w:numId="1">
     <w:abstractNumId w:val="4"/>
   </w:num>
@@ -2702,6 +3077,9 @@
   </w:num>
   <w:num w:numId="8">
     <w:abstractNumId w:val="7"/>
+  </w:num>
+  <w:num w:numId="9">
+    <w:abstractNumId w:val="8"/>
   </w:num>
 </w:numbering>
 </file>

</xml_diff>